<commit_message>
Initial BI dashboard project
</commit_message>
<xml_diff>
--- a/Screenshots.docx
+++ b/Screenshots.docx
@@ -49,6 +49,45 @@
         </w:drawing>
       </w:r>
     </w:p>
+    <w:p>
+      <w:r>
+        <w:drawing>
+          <wp:inline distT="0" distB="0" distL="0" distR="0" wp14:anchorId="112E5A9C" wp14:editId="3D3FCF6E">
+            <wp:extent cx="6949440" cy="3093720"/>
+            <wp:effectExtent l="0" t="0" r="3810" b="0"/>
+            <wp:docPr id="943643476" name="Picture 1"/>
+            <wp:cNvGraphicFramePr>
+              <a:graphicFrameLocks xmlns:a="http://schemas.openxmlformats.org/drawingml/2006/main" noChangeAspect="1"/>
+            </wp:cNvGraphicFramePr>
+            <a:graphic xmlns:a="http://schemas.openxmlformats.org/drawingml/2006/main">
+              <a:graphicData uri="http://schemas.openxmlformats.org/drawingml/2006/picture">
+                <pic:pic xmlns:pic="http://schemas.openxmlformats.org/drawingml/2006/picture">
+                  <pic:nvPicPr>
+                    <pic:cNvPr id="943643476" name=""/>
+                    <pic:cNvPicPr/>
+                  </pic:nvPicPr>
+                  <pic:blipFill>
+                    <a:blip r:embed="rId5"/>
+                    <a:stretch>
+                      <a:fillRect/>
+                    </a:stretch>
+                  </pic:blipFill>
+                  <pic:spPr>
+                    <a:xfrm>
+                      <a:off x="0" y="0"/>
+                      <a:ext cx="6963659" cy="3100050"/>
+                    </a:xfrm>
+                    <a:prstGeom prst="rect">
+                      <a:avLst/>
+                    </a:prstGeom>
+                  </pic:spPr>
+                </pic:pic>
+              </a:graphicData>
+            </a:graphic>
+          </wp:inline>
+        </w:drawing>
+      </w:r>
+    </w:p>
     <w:p/>
     <w:p>
       <w:r>
@@ -85,7 +124,7 @@
                     <pic:cNvPicPr/>
                   </pic:nvPicPr>
                   <pic:blipFill>
-                    <a:blip r:embed="rId5"/>
+                    <a:blip r:embed="rId6"/>
                     <a:stretch>
                       <a:fillRect/>
                     </a:stretch>
@@ -129,7 +168,7 @@
                     <pic:cNvPicPr/>
                   </pic:nvPicPr>
                   <pic:blipFill>
-                    <a:blip r:embed="rId6"/>
+                    <a:blip r:embed="rId7"/>
                     <a:stretch>
                       <a:fillRect/>
                     </a:stretch>
@@ -177,7 +216,7 @@
                     <pic:cNvPicPr/>
                   </pic:nvPicPr>
                   <pic:blipFill>
-                    <a:blip r:embed="rId7"/>
+                    <a:blip r:embed="rId8"/>
                     <a:stretch>
                       <a:fillRect/>
                     </a:stretch>

</xml_diff>